<commit_message>
feat: implementar edición de presupuesto, info de proyecto y barra de progreso
</commit_message>
<xml_diff>
--- a/Presentacion para distribucion/Características Principales.docx
+++ b/Presentacion para distribucion/Características Principales.docx
@@ -237,24 +237,12 @@
     </w:p>
     <w:p>
       <w:r>
-        <w:t xml:space="preserve">Gestión </w:t>
-      </w:r>
-      <w:r>
-        <w:t>multiproyecto:</w:t>
-      </w:r>
-      <w:r>
-        <w:t xml:space="preserve"> Administra múltiples proyectos de forma independiente desde una pantalla de inicio centralizada</w:t>
-      </w:r>
-    </w:p>
-    <w:p>
-      <w:r>
-        <w:t xml:space="preserve">Control de Presupuesto </w:t>
-      </w:r>
-      <w:r>
-        <w:t>Detallado:</w:t>
-      </w:r>
-      <w:r>
-        <w:t xml:space="preserve"> Define un presupuesto total y desglósalo por ítems. Visualiza métricas en tiempo real: Presupuesto Total, Ejecutado y Saldo Disponible.</w:t>
+        <w:t>Gestión multiproyecto: Administra múltiples proyectos de forma independiente desde una pantalla de inicio centralizada</w:t>
+      </w:r>
+    </w:p>
+    <w:p>
+      <w:r>
+        <w:t>Control de Presupuesto Detallado: Define un presupuesto total y desglósalo por ítems. Visualiza métricas en tiempo real: Presupuesto Total, Ejecutado y Saldo Disponible.</w:t>
       </w:r>
     </w:p>
     <w:p>
@@ -272,85 +260,37 @@
     </w:p>
     <w:p>
       <w:r>
-        <w:t xml:space="preserve">Organización por </w:t>
-      </w:r>
-      <w:r>
-        <w:t>Fases:</w:t>
-      </w:r>
-      <w:r>
-        <w:t xml:space="preserve"> Estructura tus proyectos en fases (ej. Fundaciones, Electricidad, Acabados) para un control de gastos segmentado.</w:t>
-      </w:r>
-    </w:p>
-    <w:p>
-      <w:r>
-        <w:t xml:space="preserve">Exportación </w:t>
-      </w:r>
-      <w:r>
-        <w:t>Versátil:</w:t>
-      </w:r>
-      <w:r>
-        <w:t xml:space="preserve"> Genera informes en formato Excel (.xlsx) para análisis contable o exporta la base de datos completa en JSON para respaldos.</w:t>
-      </w:r>
-    </w:p>
-    <w:p>
-      <w:r>
-        <w:t xml:space="preserve">Reportes y </w:t>
-      </w:r>
-      <w:r>
-        <w:t>Reportaje:</w:t>
-      </w:r>
-      <w:r>
-        <w:t xml:space="preserve"> Resúmenes detallados con desglose por fases, optimizados para impresión física o guardados en PDF.</w:t>
-      </w:r>
-    </w:p>
-    <w:p>
-      <w:r>
-        <w:t xml:space="preserve">Versión de </w:t>
-      </w:r>
-      <w:r>
-        <w:t>Escritorio:</w:t>
-      </w:r>
-      <w:r>
-        <w:t xml:space="preserve"> Además de ser una PWA, incluye un instalador nativo para Windows basado en </w:t>
-      </w:r>
-      <w:r>
-        <w:t>Electrón</w:t>
-      </w:r>
-      <w:r>
-        <w:t xml:space="preserve"> para un acceso más robusto.</w:t>
-      </w:r>
-    </w:p>
-    <w:p>
-      <w:r>
-        <w:t xml:space="preserve">Prevención de </w:t>
-      </w:r>
-      <w:r>
-        <w:t>Errores:</w:t>
-      </w:r>
-      <w:r>
-        <w:t xml:space="preserve"> Sistema de alertas para facturas duplicadas y validación de montos según el presupuesto disponible.</w:t>
-      </w:r>
-    </w:p>
-    <w:p>
-      <w:r>
-        <w:t xml:space="preserve">Privacidad y Seguridad </w:t>
-      </w:r>
-      <w:r>
-        <w:t>Local:</w:t>
-      </w:r>
-      <w:r>
-        <w:t xml:space="preserve"> Tus datos financieros no viajan a servidores externos; Todo se almacena de forma segura en su propio dispositivo.</w:t>
-      </w:r>
-    </w:p>
-    <w:p>
-      <w:r>
-        <w:t xml:space="preserve">Diseño Premium y </w:t>
-      </w:r>
-      <w:r>
-        <w:t>Responsivo:</w:t>
-      </w:r>
-      <w:r>
-        <w:t xml:space="preserve"> Interfaz moderna con soporte nativo para dispositivos móviles y computadoras, con </w:t>
+        <w:t>Organización por Fases: Estructura tus proyectos en fases (ej. Fundaciones, Electricidad, Acabados) para un control de gastos segmentado.</w:t>
+      </w:r>
+    </w:p>
+    <w:p>
+      <w:r>
+        <w:t>Exportación Versátil: Genera informes en formato Excel (.xlsx) para análisis contable o exporta la base de datos completa en JSON para respaldos.</w:t>
+      </w:r>
+    </w:p>
+    <w:p>
+      <w:r>
+        <w:t>Reportes y Reportaje: Resúmenes detallados con desglose por fases, optimizados para impresión física o guardados en PDF.</w:t>
+      </w:r>
+    </w:p>
+    <w:p>
+      <w:r>
+        <w:t>Versión de Escritorio: Además de ser una PWA, incluye un instalador nativo para Windows basado en Electrón para un acceso más robusto.</w:t>
+      </w:r>
+    </w:p>
+    <w:p>
+      <w:r>
+        <w:t>Prevención de Errores: Sistema de alertas para facturas duplicadas y validación de montos según el presupuesto disponible.</w:t>
+      </w:r>
+    </w:p>
+    <w:p>
+      <w:r>
+        <w:t>Privacidad y Seguridad Local: Tus datos financieros no viajan a servidores externos; Todo se almacena de forma segura en su propio dispositivo.</w:t>
+      </w:r>
+    </w:p>
+    <w:p>
+      <w:r>
+        <w:t xml:space="preserve">Diseño Premium y Responsivo: Interfaz moderna con soporte nativo para dispositivos móviles y computadoras, con </w:t>
       </w:r>
       <w:proofErr w:type="spellStart"/>
       <w:r>
@@ -359,6 +299,22 @@
       <w:proofErr w:type="spellEnd"/>
       <w:r>
         <w:t xml:space="preserve"> y visualizaciones claras.</w:t>
+      </w:r>
+    </w:p>
+    <w:p>
+      <w:r>
+        <w:t xml:space="preserve">Aplicación libre de Troyanos, seguidores y virus, ha sido analizada por </w:t>
+      </w:r>
+      <w:hyperlink r:id="rId6" w:history="1">
+        <w:r>
+          <w:rPr>
+            <w:rStyle w:val="Hipervnculo"/>
+          </w:rPr>
+          <w:t>virustotal.com</w:t>
+        </w:r>
+      </w:hyperlink>
+      <w:r>
+        <w:t xml:space="preserve"> </w:t>
       </w:r>
     </w:p>
     <w:p>
@@ -388,49 +344,28 @@
     </w:p>
     <w:p>
       <w:r>
-        <w:t xml:space="preserve">Gestión de </w:t>
-      </w:r>
-      <w:r>
-        <w:t>Proyectos:</w:t>
-      </w:r>
-      <w:r>
-        <w:t xml:space="preserve"> Al iniciar, verás un listado de tus proyectos. Puedes crear uno nuevo o seleccionar uno existente.</w:t>
-      </w:r>
-    </w:p>
-    <w:p>
-      <w:r>
-        <w:t xml:space="preserve">Configuración </w:t>
-      </w:r>
-      <w:r>
-        <w:t>Inicial:</w:t>
-      </w:r>
-      <w:r>
-        <w:t xml:space="preserve"> Dentro de un proyecto nuevo, defina el nombre de la comunidad, el número de proyecto, el año y el Presupuesto </w:t>
-      </w:r>
-      <w:r>
-        <w:t>Total.</w:t>
-      </w:r>
-    </w:p>
-    <w:p>
-      <w:r>
-        <w:t xml:space="preserve">Configura el </w:t>
-      </w:r>
-      <w:r>
-        <w:t>Presupuesto:</w:t>
-      </w:r>
-      <w:r>
-        <w:t xml:space="preserve"> Usa la pestaña "Presupuesto" para desglosar tus fondos en ítems específicos.</w:t>
-      </w:r>
-    </w:p>
-    <w:p>
-      <w:r>
-        <w:t xml:space="preserve">Crea las </w:t>
-      </w:r>
-      <w:r>
-        <w:t>Fases:</w:t>
-      </w:r>
-      <w:r>
-        <w:t xml:space="preserve"> Añade las etapas de obra (</w:t>
+        <w:t>La primera que se abre te pide que te registres, la intención es mantener un contacto directo con los usuarios, para nutrir el software, solucionar cualquier problema y aclarar dudas.</w:t>
+      </w:r>
+    </w:p>
+    <w:p>
+      <w:r>
+        <w:t>Gestión de Proyectos: Al iniciar, verás un listado de tus proyectos. Puedes crear uno nuevo o seleccionar uno existente.</w:t>
+      </w:r>
+    </w:p>
+    <w:p>
+      <w:r>
+        <w:t>Configuración Inicial: Dentro de un proyecto nuevo, defina el nombre de la comunidad, el número de proyecto, el año y el Presupuesto Total.</w:t>
+      </w:r>
+    </w:p>
+    <w:p>
+      <w:r>
+        <w:lastRenderedPageBreak/>
+        <w:t>Configura el Presupuesto: Usa la pestaña "Presupuesto" para desglosar tus fondos en ítems específicos.</w:t>
+      </w:r>
+    </w:p>
+    <w:p>
+      <w:r>
+        <w:t>Crea las Fases: Añade las etapas de obra (</w:t>
       </w:r>
       <w:proofErr w:type="spellStart"/>
       <w:r>
@@ -443,31 +378,12 @@
     </w:p>
     <w:p>
       <w:r>
-        <w:lastRenderedPageBreak/>
-        <w:t xml:space="preserve">Carga de </w:t>
-      </w:r>
-      <w:r>
-        <w:t>Gastos:</w:t>
-      </w:r>
-      <w:r>
-        <w:t xml:space="preserve"> Sube facturas en PDF o </w:t>
-      </w:r>
-      <w:r>
-        <w:t>Imagen.</w:t>
-      </w:r>
-      <w:r>
-        <w:t xml:space="preserve"> Puedes activar el "Modo Nube" para una lectura más precisa de datos complejos.</w:t>
-      </w:r>
-    </w:p>
-    <w:p>
-      <w:r>
-        <w:t xml:space="preserve">Asigna y </w:t>
-      </w:r>
-      <w:r>
-        <w:t>Verifica:</w:t>
-      </w:r>
-      <w:r>
-        <w:t xml:space="preserve"> Asegúrate de asignar cada factura a una fase. El sistema restaurará automáticamente el monto del presupuesto disponible.</w:t>
+        <w:t>Carga de Gastos: Sube facturas en PDF o Imagen. Puedes activar el "Modo Nube" para una lectura más precisa de datos complejos.</w:t>
+      </w:r>
+    </w:p>
+    <w:p>
+      <w:r>
+        <w:t>Asigna y Verifica: Asegúrate de asignar cada factura a una fase. El sistema restaurará automáticamente el monto del presupuesto disponible.</w:t>
       </w:r>
     </w:p>
     <w:p>
@@ -501,152 +417,245 @@
       </w:r>
     </w:p>
     <w:p>
-      <w:r>
-        <w:t>Núcleo:</w:t>
-      </w:r>
+      <w:pPr>
+        <w:rPr>
+          <w:sz w:val="28"/>
+          <w:szCs w:val="28"/>
+        </w:rPr>
+      </w:pPr>
+      <w:r>
+        <w:rPr>
+          <w:sz w:val="28"/>
+          <w:szCs w:val="28"/>
+        </w:rPr>
+        <w:t>Todas las herramientas utilizadas para realizar esa aplicación son de uso libre.</w:t>
+      </w:r>
+    </w:p>
+    <w:p>
+      <w:r>
+        <w:t xml:space="preserve">Núcleo: </w:t>
+      </w:r>
+      <w:proofErr w:type="spellStart"/>
+      <w:r>
+        <w:t>React</w:t>
+      </w:r>
+      <w:proofErr w:type="spellEnd"/>
+      <w:r>
+        <w:t xml:space="preserve"> 19, </w:t>
+      </w:r>
+      <w:proofErr w:type="spellStart"/>
+      <w:r>
+        <w:t>TypeScript</w:t>
+      </w:r>
+      <w:proofErr w:type="spellEnd"/>
+      <w:r>
+        <w:t>, Vite</w:t>
+      </w:r>
+    </w:p>
+    <w:p>
+      <w:r>
+        <w:t xml:space="preserve">Estilos: </w:t>
+      </w:r>
+      <w:proofErr w:type="spellStart"/>
+      <w:r>
+        <w:t>Vanilla</w:t>
+      </w:r>
+      <w:proofErr w:type="spellEnd"/>
+      <w:r>
+        <w:t xml:space="preserve"> CSS con </w:t>
+      </w:r>
+      <w:proofErr w:type="spellStart"/>
+      <w:r>
+        <w:t>Tailwind</w:t>
+      </w:r>
+      <w:proofErr w:type="spellEnd"/>
+      <w:r>
+        <w:t xml:space="preserve"> CSS</w:t>
+      </w:r>
+    </w:p>
+    <w:p>
+      <w:r>
+        <w:t xml:space="preserve">Aplicación de Escritorio: </w:t>
+      </w:r>
+      <w:proofErr w:type="spellStart"/>
+      <w:r>
+        <w:t>Electron</w:t>
+      </w:r>
+      <w:proofErr w:type="spellEnd"/>
+      <w:r>
+        <w:t xml:space="preserve"> 33+ (con instalador NSIS)</w:t>
+      </w:r>
+    </w:p>
+    <w:p>
+      <w:r>
+        <w:t>Procesamiento de Facturas: Tesseract.js (OCR Local) y Google Gemini AI (Cloud OCR)</w:t>
+      </w:r>
+    </w:p>
+    <w:p>
+      <w:r>
+        <w:t>Manejo de PDF y Datos: PDF.js, XLSX, File-</w:t>
+      </w:r>
+      <w:proofErr w:type="spellStart"/>
+      <w:r>
+        <w:t>Saver</w:t>
+      </w:r>
+      <w:proofErr w:type="spellEnd"/>
+    </w:p>
+    <w:p>
+      <w:r>
+        <w:t xml:space="preserve">Desarrollo Asistido: Google </w:t>
+      </w:r>
+      <w:proofErr w:type="spellStart"/>
+      <w:r>
+        <w:t>Antigravity</w:t>
+      </w:r>
+      <w:proofErr w:type="spellEnd"/>
+    </w:p>
+    <w:p>
+      <w:r>
+        <w:t>Despliegue Web</w:t>
+      </w:r>
+      <w:r>
+        <w:t xml:space="preserve"> y Repositorio</w:t>
+      </w:r>
+      <w:r>
+        <w:t>: Páginas de GitHub</w:t>
+      </w:r>
+    </w:p>
+    <w:p>
+      <w:r>
+        <w:t>Funcionalidad Progresiva: PWA (</w:t>
+      </w:r>
+      <w:proofErr w:type="spellStart"/>
+      <w:r>
+        <w:t>Service</w:t>
+      </w:r>
+      <w:proofErr w:type="spellEnd"/>
       <w:r>
         <w:t xml:space="preserve"> </w:t>
       </w:r>
       <w:proofErr w:type="spellStart"/>
       <w:r>
-        <w:t>React</w:t>
+        <w:t>Workers</w:t>
       </w:r>
       <w:proofErr w:type="spellEnd"/>
       <w:r>
-        <w:t xml:space="preserve"> 19, </w:t>
-      </w:r>
-      <w:proofErr w:type="spellStart"/>
-      <w:r>
-        <w:t>TypeScript</w:t>
-      </w:r>
-      <w:proofErr w:type="spellEnd"/>
-      <w:r>
-        <w:t>, Vite</w:t>
-      </w:r>
-    </w:p>
-    <w:p>
-      <w:r>
-        <w:t>Estilos:</w:t>
-      </w:r>
-      <w:r>
-        <w:t xml:space="preserve"> </w:t>
-      </w:r>
-      <w:proofErr w:type="spellStart"/>
-      <w:r>
-        <w:t>Vanilla</w:t>
-      </w:r>
-      <w:proofErr w:type="spellEnd"/>
-      <w:r>
-        <w:t xml:space="preserve"> CSS con </w:t>
-      </w:r>
-      <w:proofErr w:type="spellStart"/>
-      <w:r>
-        <w:t>Tailwind</w:t>
-      </w:r>
-      <w:proofErr w:type="spellEnd"/>
-      <w:r>
-        <w:t xml:space="preserve"> CSS</w:t>
-      </w:r>
-    </w:p>
-    <w:p>
-      <w:r>
-        <w:t xml:space="preserve">Aplicación de </w:t>
-      </w:r>
-      <w:r>
-        <w:t>Escritorio:</w:t>
-      </w:r>
-      <w:r>
-        <w:t xml:space="preserve"> </w:t>
-      </w:r>
-      <w:proofErr w:type="spellStart"/>
-      <w:r>
-        <w:t>Electron</w:t>
-      </w:r>
-      <w:proofErr w:type="spellEnd"/>
-      <w:r>
-        <w:t xml:space="preserve"> 33+ (con instalador NSIS)</w:t>
-      </w:r>
-    </w:p>
-    <w:p>
-      <w:r>
-        <w:t xml:space="preserve">Procesamiento de </w:t>
-      </w:r>
-      <w:r>
-        <w:t>Facturas:</w:t>
-      </w:r>
-      <w:r>
-        <w:t xml:space="preserve"> Tesseract.js (OCR Local) y Google Gemini AI (Cloud OCR)</w:t>
-      </w:r>
-    </w:p>
-    <w:p>
-      <w:r>
-        <w:t xml:space="preserve">Manejo de PDF y </w:t>
-      </w:r>
-      <w:r>
-        <w:t>Datos:</w:t>
-      </w:r>
-      <w:r>
-        <w:t xml:space="preserve"> PDF.js, XLSX, File-</w:t>
-      </w:r>
-      <w:proofErr w:type="spellStart"/>
-      <w:r>
-        <w:t>Saver</w:t>
-      </w:r>
-      <w:proofErr w:type="spellEnd"/>
-    </w:p>
-    <w:p>
-      <w:r>
-        <w:t xml:space="preserve">Desarrollo </w:t>
-      </w:r>
-      <w:r>
-        <w:t>Asistido:</w:t>
-      </w:r>
-      <w:r>
-        <w:t xml:space="preserve"> Google </w:t>
-      </w:r>
-      <w:proofErr w:type="spellStart"/>
-      <w:r>
-        <w:t>Antigravity</w:t>
-      </w:r>
-      <w:proofErr w:type="spellEnd"/>
-    </w:p>
-    <w:p>
-      <w:r>
-        <w:t xml:space="preserve">Despliegue </w:t>
-      </w:r>
-      <w:r>
-        <w:t>Web:</w:t>
-      </w:r>
-      <w:r>
-        <w:t xml:space="preserve"> Páginas de GitHub</w:t>
-      </w:r>
-    </w:p>
-    <w:p>
-      <w:r>
-        <w:t xml:space="preserve">Funcionalidad </w:t>
-      </w:r>
-      <w:r>
-        <w:t>Progresiva:</w:t>
-      </w:r>
-      <w:r>
-        <w:t xml:space="preserve"> PWA (</w:t>
-      </w:r>
-      <w:proofErr w:type="spellStart"/>
-      <w:r>
-        <w:t>Service</w:t>
-      </w:r>
-      <w:proofErr w:type="spellEnd"/>
-      <w:r>
-        <w:t xml:space="preserve"> </w:t>
-      </w:r>
-      <w:proofErr w:type="spellStart"/>
-      <w:r>
-        <w:t>Workers</w:t>
-      </w:r>
-      <w:proofErr w:type="spellEnd"/>
-      <w:r>
         <w:t xml:space="preserve"> y Manifiesto)</w:t>
       </w:r>
+    </w:p>
+    <w:p>
+      <w:r>
+        <w:t xml:space="preserve">Enlace de la descarga: </w:t>
+      </w:r>
+    </w:p>
+    <w:p>
+      <w:pPr>
+        <w:rPr>
+          <w:rStyle w:val="Hipervnculo"/>
+          <w:b/>
+          <w:bCs/>
+        </w:rPr>
+      </w:pPr>
+      <w:hyperlink r:id="rId7" w:history="1">
+        <w:r>
+          <w:rPr>
+            <w:rStyle w:val="Hipervnculo"/>
+            <w:b/>
+            <w:bCs/>
+          </w:rPr>
+          <w:t>https://github.com/enmaduro</w:t>
+        </w:r>
+        <w:r>
+          <w:rPr>
+            <w:rStyle w:val="Hipervnculo"/>
+            <w:b/>
+            <w:bCs/>
+          </w:rPr>
+          <w:t>/</w:t>
+        </w:r>
+        <w:r>
+          <w:rPr>
+            <w:rStyle w:val="Hipervnculo"/>
+            <w:b/>
+            <w:bCs/>
+          </w:rPr>
+          <w:t>administracion_proyectos/releases/download/v.1.0.0/Gestor.de.Gastos.Comunitarios.Setup.1.0.0.exe</w:t>
+        </w:r>
+      </w:hyperlink>
+    </w:p>
+    <w:p>
+      <w:pPr>
+        <w:rPr>
+          <w:rStyle w:val="Hipervnculo"/>
+          <w:b/>
+          <w:bCs/>
+        </w:rPr>
+      </w:pPr>
+    </w:p>
+    <w:p>
+      <w:pPr>
+        <w:jc w:val="both"/>
+        <w:rPr>
+          <w:rStyle w:val="aupe"/>
+        </w:rPr>
+      </w:pPr>
+      <w:r>
+        <w:rPr>
+          <w:rStyle w:val="aupe"/>
+        </w:rPr>
+        <w:t xml:space="preserve">Por acá les dejo, una aplicación que hice, la idea nace de la necesidad de previamente a la ejecución de un proyecto, tener un presupuesto y ya ejecutando el proyecto mantener una </w:t>
+      </w:r>
+      <w:r>
+        <w:rPr>
+          <w:rStyle w:val="aupe"/>
+        </w:rPr>
+        <w:t>relación</w:t>
+      </w:r>
+      <w:r>
+        <w:rPr>
+          <w:rStyle w:val="aupe"/>
+        </w:rPr>
+        <w:t xml:space="preserve"> de gastos, que a la </w:t>
+      </w:r>
+      <w:r>
+        <w:rPr>
+          <w:rStyle w:val="aupe"/>
+        </w:rPr>
+        <w:t>vez</w:t>
+      </w:r>
+      <w:r>
+        <w:rPr>
+          <w:rStyle w:val="aupe"/>
+        </w:rPr>
+        <w:t xml:space="preserve"> nos sirva para presentar en la </w:t>
+      </w:r>
+      <w:r>
+        <w:rPr>
+          <w:rStyle w:val="aupe"/>
+        </w:rPr>
+        <w:t>rendición</w:t>
+      </w:r>
+      <w:r>
+        <w:rPr>
+          <w:rStyle w:val="aupe"/>
+        </w:rPr>
+        <w:t xml:space="preserve"> de cuentas</w:t>
+      </w:r>
+      <w:r>
+        <w:rPr>
+          <w:rStyle w:val="aupe"/>
+        </w:rPr>
+        <w:t>. Es una aplicación muy sencilla de usar, con la cual ustedes pueden tomar una foto a la factura y así el programa extrae los datos y la incorpora, sin necesidad de digitar, o si lo prefiere lo digita, nos ayuda a mantener al día los gastos y saber cuanto se ha gastado en cada fase (Mano de Obra, Materiales y Administrativo) y saber cuanto dinero queda por ejecutar. Almacena toda la información de todos los Proyectos ejecutados.</w:t>
+      </w:r>
+    </w:p>
+    <w:p>
+      <w:pPr>
+        <w:jc w:val="both"/>
+        <w:rPr>
+          <w:b/>
+          <w:bCs/>
+        </w:rPr>
+      </w:pPr>
     </w:p>
     <w:sectPr>
       <w:pgSz w:w="12240" w:h="15840"/>
@@ -1696,6 +1705,46 @@
       <w:lang w:eastAsia="es-VE"/>
     </w:rPr>
   </w:style>
+  <w:style w:type="character" w:styleId="Hipervnculo">
+    <w:name w:val="Hyperlink"/>
+    <w:basedOn w:val="Fuentedeprrafopredeter"/>
+    <w:uiPriority w:val="99"/>
+    <w:unhideWhenUsed/>
+    <w:rsid w:val="00B523B5"/>
+    <w:rPr>
+      <w:color w:val="0563C1" w:themeColor="hyperlink"/>
+      <w:u w:val="single"/>
+    </w:rPr>
+  </w:style>
+  <w:style w:type="character" w:styleId="Mencinsinresolver">
+    <w:name w:val="Unresolved Mention"/>
+    <w:basedOn w:val="Fuentedeprrafopredeter"/>
+    <w:uiPriority w:val="99"/>
+    <w:semiHidden/>
+    <w:unhideWhenUsed/>
+    <w:rsid w:val="00B523B5"/>
+    <w:rPr>
+      <w:color w:val="605E5C"/>
+      <w:shd w:val="clear" w:color="auto" w:fill="E1DFDD"/>
+    </w:rPr>
+  </w:style>
+  <w:style w:type="character" w:styleId="Hipervnculovisitado">
+    <w:name w:val="FollowedHyperlink"/>
+    <w:basedOn w:val="Fuentedeprrafopredeter"/>
+    <w:uiPriority w:val="99"/>
+    <w:semiHidden/>
+    <w:unhideWhenUsed/>
+    <w:rsid w:val="00412742"/>
+    <w:rPr>
+      <w:color w:val="954F72" w:themeColor="followedHyperlink"/>
+      <w:u w:val="single"/>
+    </w:rPr>
+  </w:style>
+  <w:style w:type="character" w:customStyle="1" w:styleId="aupe">
+    <w:name w:val="_aupe"/>
+    <w:basedOn w:val="Fuentedeprrafopredeter"/>
+    <w:rsid w:val="0012514B"/>
+  </w:style>
 </w:styles>
 </file>
 

</xml_diff>